<commit_message>
docs: prepare separate releases for labs 02–08
</commit_message>
<xml_diff>
--- a/labs/lab06/report/infosec-intro--lab06--report.docx
+++ b/labs/lab06/report/infosec-intro--lab06--report.docx
@@ -7,7 +7,31 @@
         <w:pStyle w:val="Title"/>
       </w:pPr>
       <w:r>
-        <w:t xml:space="preserve">Отчёт по лабораторной работе №6</w:t>
+        <w:t xml:space="preserve">Отчёт</w:t>
+      </w:r>
+      <w:r>
+        <w:t xml:space="preserve"> </w:t>
+      </w:r>
+      <w:r>
+        <w:t xml:space="preserve">по</w:t>
+      </w:r>
+      <w:r>
+        <w:t xml:space="preserve"> </w:t>
+      </w:r>
+      <w:r>
+        <w:t xml:space="preserve">лабораторной</w:t>
+      </w:r>
+      <w:r>
+        <w:t xml:space="preserve"> </w:t>
+      </w:r>
+      <w:r>
+        <w:t xml:space="preserve">работе</w:t>
+      </w:r>
+      <w:r>
+        <w:t xml:space="preserve"> </w:t>
+      </w:r>
+      <w:r>
+        <w:t xml:space="preserve">№6</w:t>
       </w:r>
     </w:p>
     <w:p>
@@ -15,7 +39,19 @@
         <w:pStyle w:val="Subtitle"/>
       </w:pPr>
       <w:r>
-        <w:t xml:space="preserve">Знакомство с SELinux</w:t>
+        <w:t xml:space="preserve">Знакомство</w:t>
+      </w:r>
+      <w:r>
+        <w:t xml:space="preserve"> </w:t>
+      </w:r>
+      <w:r>
+        <w:t xml:space="preserve">с</w:t>
+      </w:r>
+      <w:r>
+        <w:t xml:space="preserve"> </w:t>
+      </w:r>
+      <w:r>
+        <w:t xml:space="preserve">SELinux</w:t>
       </w:r>
     </w:p>
     <w:p>
@@ -23,42 +59,73 @@
         <w:pStyle w:val="Author"/>
       </w:pPr>
       <w:r>
-        <w:t xml:space="preserve">Архипов Александр</w:t>
-      </w:r>
-    </w:p>
-    <w:sdt>
-      <w:sdtPr>
-        <w:docPartObj>
-          <w:docPartGallery w:val="Table of Contents"/>
-          <w:docPartUnique/>
-        </w:docPartObj>
-      </w:sdtPr>
-      <w:sdtContent>
-        <w:p>
-          <w:pPr>
-            <w:pStyle w:val="TOCHeading"/>
-          </w:pPr>
-          <w:r>
-            <w:t xml:space="preserve">Содержание</w:t>
-          </w:r>
-        </w:p>
-        <w:p>
-          <w:r>
-            <w:fldChar w:fldCharType="begin" w:dirty="true"/>
-            <w:instrText xml:space="preserve">TOC \o "1-2" \h \z \u</w:instrText>
-            <w:fldChar w:fldCharType="separate"/>
-            <w:fldChar w:fldCharType="end"/>
-          </w:r>
-        </w:p>
-      </w:sdtContent>
-    </w:sdt>
-    <w:bookmarkStart w:id="9" w:name="цель-работы"/>
+        <w:t xml:space="preserve">Архипов</w:t>
+      </w:r>
+      <w:r>
+        <w:t xml:space="preserve"> </w:t>
+      </w:r>
+      <w:r>
+        <w:t xml:space="preserve">Александр</w:t>
+      </w:r>
+      <w:r>
+        <w:t xml:space="preserve"> </w:t>
+      </w:r>
+      <w:r>
+        <w:t xml:space="preserve">Сергеевич</w:t>
+      </w:r>
+    </w:p>
+    <w:p>
+      <w:pPr>
+        <w:pStyle w:val="Author"/>
+      </w:pPr>
+      <w:r>
+        <w:t xml:space="preserve">НБИбд-01-24</w:t>
+      </w:r>
+    </w:p>
+    <w:p>
+      <w:pPr>
+        <w:pStyle w:val="Author"/>
+      </w:pPr>
+      <w:r>
+        <w:t xml:space="preserve">1132239106</w:t>
+      </w:r>
+      <w:r>
+        <w:t xml:space="preserve"> </w:t>
+      </w:r>
+      <w:r>
+        <w:t xml:space="preserve">|</w:t>
+      </w:r>
+      <w:r>
+        <w:t xml:space="preserve"> </w:t>
+      </w:r>
+      <w:r>
+        <w:t xml:space="preserve">1132239106@rudn.ru</w:t>
+      </w:r>
+    </w:p>
+    <w:p>
+      <w:pPr>
+        <w:pStyle w:val="Date"/>
+      </w:pPr>
+      <w:r>
+        <w:t xml:space="preserve">07.10.2026</w:t>
+      </w:r>
+    </w:p>
+    <w:bookmarkStart w:id="20" w:name="цель-работы"/>
     <w:p>
       <w:pPr>
         <w:pStyle w:val="Heading1"/>
       </w:pPr>
       <w:r>
-        <w:t xml:space="preserve">1. Цель работы</w:t>
+        <w:rPr>
+          <w:rStyle w:val="SectionNumber"/>
+        </w:rPr>
+        <w:t xml:space="preserve">1</w:t>
+      </w:r>
+      <w:r>
+        <w:tab/>
+      </w:r>
+      <w:r>
+        <w:t xml:space="preserve">Цель работы</w:t>
       </w:r>
     </w:p>
     <w:p>
@@ -69,23 +136,41 @@
         <w:t xml:space="preserve">Развить навыки администрирования ОС Linux. Получить первое практическое знакомство с технологией SELinux. Проверить работу SELinx на практике совместно с веб-сервером Apache</w:t>
       </w:r>
     </w:p>
-    <w:bookmarkEnd w:id="9"/>
-    <w:bookmarkStart w:id="44" w:name="выполнение-лабораторной-работы"/>
+    <w:bookmarkEnd w:id="20"/>
+    <w:bookmarkStart w:id="47" w:name="выполнение-лабораторной-работы"/>
     <w:p>
       <w:pPr>
         <w:pStyle w:val="Heading1"/>
       </w:pPr>
       <w:r>
-        <w:t xml:space="preserve">2. Выполнение лабораторной работы</w:t>
-      </w:r>
-    </w:p>
-    <w:bookmarkStart w:id="10" w:name="подготовка"/>
+        <w:rPr>
+          <w:rStyle w:val="SectionNumber"/>
+        </w:rPr>
+        <w:t xml:space="preserve">2</w:t>
+      </w:r>
+      <w:r>
+        <w:tab/>
+      </w:r>
+      <w:r>
+        <w:t xml:space="preserve">Выполнение лабораторной работы</w:t>
+      </w:r>
+    </w:p>
+    <w:bookmarkStart w:id="21" w:name="подготовка"/>
     <w:p>
       <w:pPr>
         <w:pStyle w:val="Heading2"/>
       </w:pPr>
       <w:r>
-        <w:t xml:space="preserve">2.1 Подготовка</w:t>
+        <w:rPr>
+          <w:rStyle w:val="SectionNumber"/>
+        </w:rPr>
+        <w:t xml:space="preserve">2.1</w:t>
+      </w:r>
+      <w:r>
+        <w:tab/>
+      </w:r>
+      <w:r>
+        <w:t xml:space="preserve">Подготовка</w:t>
       </w:r>
     </w:p>
     <w:p>
@@ -121,14 +206,23 @@
         <w:t xml:space="preserve">Открыли порты для работы с протоколом http</w:t>
       </w:r>
     </w:p>
-    <w:bookmarkEnd w:id="10"/>
-    <w:bookmarkStart w:id="43" w:name="изучение-механики-setuid"/>
+    <w:bookmarkEnd w:id="21"/>
+    <w:bookmarkStart w:id="46" w:name="изучение-механики-selinux"/>
     <w:p>
       <w:pPr>
         <w:pStyle w:val="Heading2"/>
       </w:pPr>
       <w:r>
-        <w:t xml:space="preserve">2.2 Изучение механики SetUID</w:t>
+        <w:rPr>
+          <w:rStyle w:val="SectionNumber"/>
+        </w:rPr>
+        <w:t xml:space="preserve">2.2</w:t>
+      </w:r>
+      <w:r>
+        <w:tab/>
+      </w:r>
+      <w:r>
+        <w:t xml:space="preserve">Изучение механики SELinux</w:t>
       </w:r>
     </w:p>
     <w:p>
@@ -153,7 +247,6 @@
         <w:t xml:space="preserve">Обратитесь с помощью браузера к веб-серверу, запущенному на вашем компьютере, и убедитесь, что последний работает: service httpd status или /etc/rc.d/init.d/httpd status Если не работает, запустите его так же, но с параметром start.</w:t>
       </w:r>
     </w:p>
-    <w:bookmarkStart w:id="14" w:name="fig:001"/>
     <w:p>
       <w:pPr>
         <w:pStyle w:val="CaptionedFigure"/>
@@ -163,18 +256,18 @@
           <wp:inline>
             <wp:extent cx="3733800" cy="2029045"/>
             <wp:effectExtent b="0" l="0" r="0" t="0"/>
-            <wp:docPr descr="запуск http" title="" id="12" name="Picture"/>
+            <wp:docPr descr="запуск http" title="" id="23" name="Picture"/>
             <a:graphic>
               <a:graphicData uri="http://schemas.openxmlformats.org/drawingml/2006/picture">
                 <pic:pic>
                   <pic:nvPicPr>
-                    <pic:cNvPr descr="image/01.png" id="13" name="Picture"/>
+                    <pic:cNvPr descr="image/01.png" id="24" name="Picture"/>
                     <pic:cNvPicPr>
                       <a:picLocks noChangeArrowheads="1" noChangeAspect="1"/>
                     </pic:cNvPicPr>
                   </pic:nvPicPr>
                   <pic:blipFill>
-                    <a:blip r:embed="rId11"/>
+                    <a:blip r:embed="rId22"/>
                     <a:stretch>
                       <a:fillRect/>
                     </a:stretch>
@@ -209,20 +302,18 @@
         <w:t xml:space="preserve">запуск http</w:t>
       </w:r>
     </w:p>
-    <w:bookmarkEnd w:id="14"/>
-    <w:p>
-      <w:pPr>
-        <w:pStyle w:val="Compact"/>
+    <w:p>
+      <w:pPr>
         <w:numPr>
           <w:ilvl w:val="0"/>
           <w:numId w:val="1003"/>
         </w:numPr>
+        <w:pStyle w:val="Compact"/>
       </w:pPr>
       <w:r>
         <w:t xml:space="preserve">Найдите веб-сервер Apache в списке процессов, определите его контекст безопасности и занесите эту информацию в отчёт. Например, можно использовать команду ps auxZ | grep httpd или ps -eZ | grep httpd</w:t>
       </w:r>
     </w:p>
-    <w:bookmarkStart w:id="18" w:name="fig:002"/>
     <w:p>
       <w:pPr>
         <w:pStyle w:val="CaptionedFigure"/>
@@ -232,18 +323,18 @@
           <wp:inline>
             <wp:extent cx="3733800" cy="1659466"/>
             <wp:effectExtent b="0" l="0" r="0" t="0"/>
-            <wp:docPr descr="контекст безопасности http" title="" id="16" name="Picture"/>
+            <wp:docPr descr="контекст безопасности http" title="" id="26" name="Picture"/>
             <a:graphic>
               <a:graphicData uri="http://schemas.openxmlformats.org/drawingml/2006/picture">
                 <pic:pic>
                   <pic:nvPicPr>
-                    <pic:cNvPr descr="image/02.png" id="17" name="Picture"/>
+                    <pic:cNvPr descr="image/02.png" id="27" name="Picture"/>
                     <pic:cNvPicPr>
                       <a:picLocks noChangeArrowheads="1" noChangeAspect="1"/>
                     </pic:cNvPicPr>
                   </pic:nvPicPr>
                   <pic:blipFill>
-                    <a:blip r:embed="rId15"/>
+                    <a:blip r:embed="rId25"/>
                     <a:stretch>
                       <a:fillRect/>
                     </a:stretch>
@@ -278,20 +369,18 @@
         <w:t xml:space="preserve">контекст безопасности http</w:t>
       </w:r>
     </w:p>
-    <w:bookmarkEnd w:id="18"/>
-    <w:p>
-      <w:pPr>
-        <w:pStyle w:val="Compact"/>
+    <w:p>
+      <w:pPr>
         <w:numPr>
           <w:ilvl w:val="0"/>
           <w:numId w:val="1004"/>
         </w:numPr>
+        <w:pStyle w:val="Compact"/>
       </w:pPr>
       <w:r>
         <w:t xml:space="preserve">Посмотрите текущее состояние переключателей SELinux для Apache с помощью команды sestatus -bigrep httpd Обратите внимание, что многие из них находятся в положении «off».</w:t>
       </w:r>
     </w:p>
-    <w:bookmarkStart w:id="22" w:name="fig:003"/>
     <w:p>
       <w:pPr>
         <w:pStyle w:val="CaptionedFigure"/>
@@ -301,18 +390,18 @@
           <wp:inline>
             <wp:extent cx="3733800" cy="3220323"/>
             <wp:effectExtent b="0" l="0" r="0" t="0"/>
-            <wp:docPr descr="переключатели SELinux для http" title="" id="20" name="Picture"/>
+            <wp:docPr descr="переключатели SELinux для http" title="" id="29" name="Picture"/>
             <a:graphic>
               <a:graphicData uri="http://schemas.openxmlformats.org/drawingml/2006/picture">
                 <pic:pic>
                   <pic:nvPicPr>
-                    <pic:cNvPr descr="image/03.png" id="21" name="Picture"/>
+                    <pic:cNvPr descr="image/03.png" id="30" name="Picture"/>
                     <pic:cNvPicPr>
                       <a:picLocks noChangeArrowheads="1" noChangeAspect="1"/>
                     </pic:cNvPicPr>
                   </pic:nvPicPr>
                   <pic:blipFill>
-                    <a:blip r:embed="rId19"/>
+                    <a:blip r:embed="rId28"/>
                     <a:stretch>
                       <a:fillRect/>
                     </a:stretch>
@@ -347,7 +436,6 @@
         <w:t xml:space="preserve">переключатели SELinux для http</w:t>
       </w:r>
     </w:p>
-    <w:bookmarkEnd w:id="22"/>
     <w:p>
       <w:pPr>
         <w:numPr>
@@ -425,7 +513,6 @@
         <w:t xml:space="preserve">Обратитесь к файлу через веб-сервер, введя в браузере адрес http://127.0.0.1/test.html. Убедитесь, что файл был успешно отображён.</w:t>
       </w:r>
     </w:p>
-    <w:bookmarkStart w:id="26" w:name="fig:004"/>
     <w:p>
       <w:pPr>
         <w:pStyle w:val="CaptionedFigure"/>
@@ -435,18 +522,18 @@
           <wp:inline>
             <wp:extent cx="3733800" cy="1896722"/>
             <wp:effectExtent b="0" l="0" r="0" t="0"/>
-            <wp:docPr descr="создание html-файла и доступ по http" title="" id="24" name="Picture"/>
+            <wp:docPr descr="создание html-файла и доступ по http" title="" id="32" name="Picture"/>
             <a:graphic>
               <a:graphicData uri="http://schemas.openxmlformats.org/drawingml/2006/picture">
                 <pic:pic>
                   <pic:nvPicPr>
-                    <pic:cNvPr descr="image/04.png" id="25" name="Picture"/>
+                    <pic:cNvPr descr="image/04.png" id="33" name="Picture"/>
                     <pic:cNvPicPr>
                       <a:picLocks noChangeArrowheads="1" noChangeAspect="1"/>
                     </pic:cNvPicPr>
                   </pic:nvPicPr>
                   <pic:blipFill>
-                    <a:blip r:embed="rId23"/>
+                    <a:blip r:embed="rId31"/>
                     <a:stretch>
                       <a:fillRect/>
                     </a:stretch>
@@ -481,7 +568,6 @@
         <w:t xml:space="preserve">создание html-файла и доступ по http</w:t>
       </w:r>
     </w:p>
-    <w:bookmarkEnd w:id="26"/>
     <w:p>
       <w:pPr>
         <w:numPr>
@@ -515,7 +601,6 @@
         <w:t xml:space="preserve">Попробуйте ещё раз получить доступ к файлу через веб-сервер, введя в браузере адрес http://127.0.0.1/test.html. Вы должны получить сообщение об ошибке: Forbidden You don’t have permission to access /test.html on this server. При изменении контекста файл стал считаться чужим для http и программа не может его прочитать.</w:t>
       </w:r>
     </w:p>
-    <w:bookmarkStart w:id="30" w:name="fig:005"/>
     <w:p>
       <w:pPr>
         <w:pStyle w:val="CaptionedFigure"/>
@@ -525,18 +610,18 @@
           <wp:inline>
             <wp:extent cx="3733800" cy="1921678"/>
             <wp:effectExtent b="0" l="0" r="0" t="0"/>
-            <wp:docPr descr="ошибка доступа после изменения контекста" title="" id="28" name="Picture"/>
+            <wp:docPr descr="ошибка доступа после изменения контекста" title="" id="35" name="Picture"/>
             <a:graphic>
               <a:graphicData uri="http://schemas.openxmlformats.org/drawingml/2006/picture">
                 <pic:pic>
                   <pic:nvPicPr>
-                    <pic:cNvPr descr="image/05.png" id="29" name="Picture"/>
+                    <pic:cNvPr descr="image/05.png" id="36" name="Picture"/>
                     <pic:cNvPicPr>
                       <a:picLocks noChangeArrowheads="1" noChangeAspect="1"/>
                     </pic:cNvPicPr>
                   </pic:nvPicPr>
                   <pic:blipFill>
-                    <a:blip r:embed="rId27"/>
+                    <a:blip r:embed="rId34"/>
                     <a:stretch>
                       <a:fillRect/>
                     </a:stretch>
@@ -571,20 +656,18 @@
         <w:t xml:space="preserve">ошибка доступа после изменения контекста</w:t>
       </w:r>
     </w:p>
-    <w:bookmarkEnd w:id="30"/>
-    <w:p>
-      <w:pPr>
-        <w:pStyle w:val="Compact"/>
+    <w:p>
+      <w:pPr>
         <w:numPr>
           <w:ilvl w:val="0"/>
           <w:numId w:val="1007"/>
         </w:numPr>
+        <w:pStyle w:val="Compact"/>
       </w:pPr>
       <w:r>
         <w:t xml:space="preserve">Проанализируйте ситуацию. Почему файл не был отображён, если права доступа позволяют читать этот файл любому пользователю? ls -l /var/www/html/test.html Просмотрите log-файлы веб-сервера Apache. Также просмотрите системный лог-файл: tail /var/log/messages Если в системе окажутся запущенными процессы setroubleshootd и audtd, то вы также сможете увидеть ошибки, аналогичные указанным выше, в файле /var/log/audit/audit.log. Проверьте это утверждение самостоятельно.</w:t>
       </w:r>
     </w:p>
-    <w:bookmarkStart w:id="34" w:name="fig:006"/>
     <w:p>
       <w:pPr>
         <w:pStyle w:val="CaptionedFigure"/>
@@ -594,18 +677,18 @@
           <wp:inline>
             <wp:extent cx="3733800" cy="3464591"/>
             <wp:effectExtent b="0" l="0" r="0" t="0"/>
-            <wp:docPr descr="лог ошибок" title="" id="32" name="Picture"/>
+            <wp:docPr descr="лог ошибок" title="" id="38" name="Picture"/>
             <a:graphic>
               <a:graphicData uri="http://schemas.openxmlformats.org/drawingml/2006/picture">
                 <pic:pic>
                   <pic:nvPicPr>
-                    <pic:cNvPr descr="image/06.png" id="33" name="Picture"/>
+                    <pic:cNvPr descr="image/06.png" id="39" name="Picture"/>
                     <pic:cNvPicPr>
                       <a:picLocks noChangeArrowheads="1" noChangeAspect="1"/>
                     </pic:cNvPicPr>
                   </pic:nvPicPr>
                   <pic:blipFill>
-                    <a:blip r:embed="rId31"/>
+                    <a:blip r:embed="rId37"/>
                     <a:stretch>
                       <a:fillRect/>
                     </a:stretch>
@@ -640,20 +723,18 @@
         <w:t xml:space="preserve">лог ошибок</w:t>
       </w:r>
     </w:p>
-    <w:bookmarkEnd w:id="34"/>
-    <w:p>
-      <w:pPr>
-        <w:pStyle w:val="Compact"/>
+    <w:p>
+      <w:pPr>
         <w:numPr>
           <w:ilvl w:val="0"/>
           <w:numId w:val="1008"/>
         </w:numPr>
+        <w:pStyle w:val="Compact"/>
       </w:pPr>
       <w:r>
         <w:t xml:space="preserve">Попробуйте запустить веб-сервер Apache на прослушивание ТСР-порта 81 (а не 80, как рекомендует IANA и прописано в /etc/services). Для этого в файле /etc/httpd/httpd.conf найдите строчку Listen 80 и замените её на Listen 81.</w:t>
       </w:r>
     </w:p>
-    <w:bookmarkStart w:id="38" w:name="fig:007"/>
     <w:p>
       <w:pPr>
         <w:pStyle w:val="CaptionedFigure"/>
@@ -663,18 +744,18 @@
           <wp:inline>
             <wp:extent cx="3733800" cy="2104292"/>
             <wp:effectExtent b="0" l="0" r="0" t="0"/>
-            <wp:docPr descr="переключение порта" title="" id="36" name="Picture"/>
+            <wp:docPr descr="переключение порта" title="" id="41" name="Picture"/>
             <a:graphic>
               <a:graphicData uri="http://schemas.openxmlformats.org/drawingml/2006/picture">
                 <pic:pic>
                   <pic:nvPicPr>
-                    <pic:cNvPr descr="image/07.png" id="37" name="Picture"/>
+                    <pic:cNvPr descr="image/07.png" id="42" name="Picture"/>
                     <pic:cNvPicPr>
                       <a:picLocks noChangeArrowheads="1" noChangeAspect="1"/>
                     </pic:cNvPicPr>
                   </pic:nvPicPr>
                   <pic:blipFill>
-                    <a:blip r:embed="rId35"/>
+                    <a:blip r:embed="rId40"/>
                     <a:stretch>
                       <a:fillRect/>
                     </a:stretch>
@@ -709,7 +790,6 @@
         <w:t xml:space="preserve">переключение порта</w:t>
       </w:r>
     </w:p>
-    <w:bookmarkEnd w:id="38"/>
     <w:p>
       <w:pPr>
         <w:numPr>
@@ -771,7 +851,6 @@
         <w:t xml:space="preserve">Верните контекст httpd_sys_cоntent__t к файлу /var/www/html/ test.html: chcon -t httpd_sys_content_t /var/www/html/test.html После этого попробуйте получить доступ к файлу через веб-сервер, введя в браузере адрес http://127.0.0.1:81/test.html. Вы должны увидеть содержимое файла — слово «test».</w:t>
       </w:r>
     </w:p>
-    <w:bookmarkStart w:id="42" w:name="fig:008"/>
     <w:p>
       <w:pPr>
         <w:pStyle w:val="CaptionedFigure"/>
@@ -781,18 +860,18 @@
           <wp:inline>
             <wp:extent cx="3733800" cy="1984871"/>
             <wp:effectExtent b="0" l="0" r="0" t="0"/>
-            <wp:docPr descr="доступ по http на 81 порт" title="" id="40" name="Picture"/>
+            <wp:docPr descr="доступ по http на 81 порт" title="" id="44" name="Picture"/>
             <a:graphic>
               <a:graphicData uri="http://schemas.openxmlformats.org/drawingml/2006/picture">
                 <pic:pic>
                   <pic:nvPicPr>
-                    <pic:cNvPr descr="image/08.png" id="41" name="Picture"/>
+                    <pic:cNvPr descr="image/08.png" id="45" name="Picture"/>
                     <pic:cNvPicPr>
                       <a:picLocks noChangeArrowheads="1" noChangeAspect="1"/>
                     </pic:cNvPicPr>
                   </pic:nvPicPr>
                   <pic:blipFill>
-                    <a:blip r:embed="rId39"/>
+                    <a:blip r:embed="rId43"/>
                     <a:stretch>
                       <a:fillRect/>
                     </a:stretch>
@@ -827,7 +906,6 @@
         <w:t xml:space="preserve">доступ по http на 81 порт</w:t>
       </w:r>
     </w:p>
-    <w:bookmarkEnd w:id="42"/>
     <w:p>
       <w:pPr>
         <w:numPr>
@@ -861,15 +939,24 @@
         <w:t xml:space="preserve">Удалите файл /var/www/html/test.html: rm /var/www/html/test.html</w:t>
       </w:r>
     </w:p>
-    <w:bookmarkEnd w:id="43"/>
-    <w:bookmarkEnd w:id="44"/>
-    <w:bookmarkStart w:id="45" w:name="выводы"/>
+    <w:bookmarkEnd w:id="46"/>
+    <w:bookmarkEnd w:id="47"/>
+    <w:bookmarkStart w:id="48" w:name="выводы"/>
     <w:p>
       <w:pPr>
         <w:pStyle w:val="Heading1"/>
       </w:pPr>
       <w:r>
-        <w:t xml:space="preserve">3. Выводы</w:t>
+        <w:rPr>
+          <w:rStyle w:val="SectionNumber"/>
+        </w:rPr>
+        <w:t xml:space="preserve">3</w:t>
+      </w:r>
+      <w:r>
+        <w:tab/>
+      </w:r>
+      <w:r>
+        <w:t xml:space="preserve">Выводы</w:t>
       </w:r>
     </w:p>
     <w:p>
@@ -880,8 +967,8 @@
         <w:t xml:space="preserve">В процессе выполнения лабораторной работы мною были получены базовые навыки работы с технологией seLinux.</w:t>
       </w:r>
     </w:p>
-    <w:bookmarkEnd w:id="45"/>
-    <w:bookmarkStart w:id="48" w:name="список-литературы"/>
+    <w:bookmarkEnd w:id="48"/>
+    <w:bookmarkStart w:id="51" w:name="список-литературы"/>
     <w:p>
       <w:pPr>
         <w:pStyle w:val="Heading1"/>
@@ -892,13 +979,13 @@
     </w:p>
     <w:p>
       <w:pPr>
-        <w:pStyle w:val="Compact"/>
         <w:numPr>
           <w:ilvl w:val="0"/>
           <w:numId w:val="1011"/>
         </w:numPr>
-      </w:pPr>
-      <w:hyperlink r:id="rId46">
+        <w:pStyle w:val="Compact"/>
+      </w:pPr>
+      <w:hyperlink r:id="rId49">
         <w:r>
           <w:rPr>
             <w:rStyle w:val="Hyperlink"/>
@@ -909,13 +996,13 @@
     </w:p>
     <w:p>
       <w:pPr>
-        <w:pStyle w:val="Compact"/>
         <w:numPr>
           <w:ilvl w:val="0"/>
           <w:numId w:val="1011"/>
         </w:numPr>
-      </w:pPr>
-      <w:hyperlink r:id="rId47">
+        <w:pStyle w:val="Compact"/>
+      </w:pPr>
+      <w:hyperlink r:id="rId50">
         <w:r>
           <w:rPr>
             <w:rStyle w:val="Hyperlink"/>
@@ -924,7 +1011,7 @@
         </w:r>
       </w:hyperlink>
     </w:p>
-    <w:bookmarkEnd w:id="48"/>
+    <w:bookmarkEnd w:id="51"/>
     <w:sectPr>
       <w:footnotePr>
         <w:numRestart w:val="eachSect"/>
@@ -960,14 +1047,14 @@
 <file path=word/numbering.xml><?xml version="1.0" encoding="utf-8"?>
 <w:numbering xmlns:w="http://schemas.openxmlformats.org/wordprocessingml/2006/main">
   <w:abstractNum w:abstractNumId="990">
-    <w:nsid w:val="0000A990"/>
+    <w:nsid w:val="A990"/>
     <w:multiLevelType w:val="multilevel"/>
     <w:lvl w:ilvl="0">
       <w:numFmt w:val="bullet"/>
       <w:lvlText w:val=" "/>
       <w:lvlJc w:val="left"/>
       <w:pPr>
-        <w:ind w:left="720" w:hanging="360"/>
+        <w:ind w:left="720" w:hanging="480"/>
       </w:pPr>
     </w:lvl>
     <w:lvl w:ilvl="1">
@@ -975,7 +1062,7 @@
       <w:lvlText w:val=" "/>
       <w:lvlJc w:val="left"/>
       <w:pPr>
-        <w:ind w:left="1440" w:hanging="360"/>
+        <w:ind w:left="1440" w:hanging="480"/>
       </w:pPr>
     </w:lvl>
     <w:lvl w:ilvl="2">
@@ -983,7 +1070,7 @@
       <w:lvlText w:val=" "/>
       <w:lvlJc w:val="left"/>
       <w:pPr>
-        <w:ind w:left="2160" w:hanging="360"/>
+        <w:ind w:left="2160" w:hanging="480"/>
       </w:pPr>
     </w:lvl>
     <w:lvl w:ilvl="3">
@@ -991,7 +1078,7 @@
       <w:lvlText w:val=" "/>
       <w:lvlJc w:val="left"/>
       <w:pPr>
-        <w:ind w:left="2880" w:hanging="360"/>
+        <w:ind w:left="2880" w:hanging="480"/>
       </w:pPr>
     </w:lvl>
     <w:lvl w:ilvl="4">
@@ -999,7 +1086,7 @@
       <w:lvlText w:val=" "/>
       <w:lvlJc w:val="left"/>
       <w:pPr>
-        <w:ind w:left="3600" w:hanging="360"/>
+        <w:ind w:left="3600" w:hanging="480"/>
       </w:pPr>
     </w:lvl>
     <w:lvl w:ilvl="5">
@@ -1007,7 +1094,7 @@
       <w:lvlText w:val=" "/>
       <w:lvlJc w:val="left"/>
       <w:pPr>
-        <w:ind w:left="4320" w:hanging="360"/>
+        <w:ind w:left="4320" w:hanging="480"/>
       </w:pPr>
     </w:lvl>
     <w:lvl w:ilvl="6">
@@ -1015,7 +1102,7 @@
       <w:lvlText w:val=" "/>
       <w:lvlJc w:val="left"/>
       <w:pPr>
-        <w:ind w:left="5040" w:hanging="360"/>
+        <w:ind w:left="5040" w:hanging="480"/>
       </w:pPr>
     </w:lvl>
     <w:lvl w:ilvl="7">
@@ -1023,7 +1110,7 @@
       <w:lvlText w:val=" "/>
       <w:lvlJc w:val="left"/>
       <w:pPr>
-        <w:ind w:left="5760" w:hanging="360"/>
+        <w:ind w:left="5760" w:hanging="480"/>
       </w:pPr>
     </w:lvl>
     <w:lvl w:ilvl="8">
@@ -1031,12 +1118,12 @@
       <w:lvlText w:val=" "/>
       <w:lvlJc w:val="left"/>
       <w:pPr>
-        <w:ind w:left="6480" w:hanging="360"/>
+        <w:ind w:left="6480" w:hanging="480"/>
       </w:pPr>
     </w:lvl>
   </w:abstractNum>
   <w:abstractNum w:abstractNumId="99411">
-    <w:nsid w:val="00A99411"/>
+    <w:nsid w:val="A99411"/>
     <w:multiLevelType w:val="multilevel"/>
     <w:lvl w:ilvl="0">
       <w:start w:val="1"/>
@@ -1044,7 +1131,7 @@
       <w:lvlText w:val="%1."/>
       <w:lvlJc w:val="left"/>
       <w:pPr>
-        <w:ind w:left="720" w:hanging="360"/>
+        <w:ind w:left="720" w:hanging="480"/>
       </w:pPr>
     </w:lvl>
     <w:lvl w:ilvl="1">
@@ -1053,7 +1140,7 @@
       <w:lvlText w:val="%2."/>
       <w:lvlJc w:val="left"/>
       <w:pPr>
-        <w:ind w:left="1440" w:hanging="360"/>
+        <w:ind w:left="1440" w:hanging="480"/>
       </w:pPr>
     </w:lvl>
     <w:lvl w:ilvl="2">
@@ -1062,7 +1149,7 @@
       <w:lvlText w:val="%3."/>
       <w:lvlJc w:val="left"/>
       <w:pPr>
-        <w:ind w:left="2160" w:hanging="360"/>
+        <w:ind w:left="2160" w:hanging="480"/>
       </w:pPr>
     </w:lvl>
     <w:lvl w:ilvl="3">
@@ -1071,7 +1158,7 @@
       <w:lvlText w:val="%4."/>
       <w:lvlJc w:val="left"/>
       <w:pPr>
-        <w:ind w:left="2880" w:hanging="360"/>
+        <w:ind w:left="2880" w:hanging="480"/>
       </w:pPr>
     </w:lvl>
     <w:lvl w:ilvl="4">
@@ -1080,7 +1167,7 @@
       <w:lvlText w:val="%5."/>
       <w:lvlJc w:val="left"/>
       <w:pPr>
-        <w:ind w:left="3600" w:hanging="360"/>
+        <w:ind w:left="3600" w:hanging="480"/>
       </w:pPr>
     </w:lvl>
     <w:lvl w:ilvl="5">
@@ -1089,7 +1176,7 @@
       <w:lvlText w:val="%6."/>
       <w:lvlJc w:val="left"/>
       <w:pPr>
-        <w:ind w:left="4320" w:hanging="360"/>
+        <w:ind w:left="4320" w:hanging="480"/>
       </w:pPr>
     </w:lvl>
     <w:lvl w:ilvl="6">
@@ -1098,7 +1185,7 @@
       <w:lvlText w:val="%7."/>
       <w:lvlJc w:val="left"/>
       <w:pPr>
-        <w:ind w:left="5040" w:hanging="360"/>
+        <w:ind w:left="5040" w:hanging="480"/>
       </w:pPr>
     </w:lvl>
     <w:lvl w:ilvl="7">
@@ -1107,7 +1194,7 @@
       <w:lvlText w:val="%8."/>
       <w:lvlJc w:val="left"/>
       <w:pPr>
-        <w:ind w:left="5760" w:hanging="360"/>
+        <w:ind w:left="5760" w:hanging="480"/>
       </w:pPr>
     </w:lvl>
     <w:lvl w:ilvl="8">
@@ -1116,12 +1203,12 @@
       <w:lvlText w:val="%9."/>
       <w:lvlJc w:val="left"/>
       <w:pPr>
-        <w:ind w:left="6480" w:hanging="360"/>
+        <w:ind w:left="6480" w:hanging="480"/>
       </w:pPr>
     </w:lvl>
   </w:abstractNum>
   <w:abstractNum w:abstractNumId="99413">
-    <w:nsid w:val="00A99413"/>
+    <w:nsid w:val="A99413"/>
     <w:multiLevelType w:val="multilevel"/>
     <w:lvl w:ilvl="0">
       <w:start w:val="3"/>
@@ -1129,7 +1216,7 @@
       <w:lvlText w:val="%1."/>
       <w:lvlJc w:val="left"/>
       <w:pPr>
-        <w:ind w:left="720" w:hanging="360"/>
+        <w:ind w:left="720" w:hanging="480"/>
       </w:pPr>
     </w:lvl>
     <w:lvl w:ilvl="1">
@@ -1138,7 +1225,7 @@
       <w:lvlText w:val="%2."/>
       <w:lvlJc w:val="left"/>
       <w:pPr>
-        <w:ind w:left="1440" w:hanging="360"/>
+        <w:ind w:left="1440" w:hanging="480"/>
       </w:pPr>
     </w:lvl>
     <w:lvl w:ilvl="2">
@@ -1147,7 +1234,7 @@
       <w:lvlText w:val="%3."/>
       <w:lvlJc w:val="left"/>
       <w:pPr>
-        <w:ind w:left="2160" w:hanging="360"/>
+        <w:ind w:left="2160" w:hanging="480"/>
       </w:pPr>
     </w:lvl>
     <w:lvl w:ilvl="3">
@@ -1156,7 +1243,7 @@
       <w:lvlText w:val="%4."/>
       <w:lvlJc w:val="left"/>
       <w:pPr>
-        <w:ind w:left="2880" w:hanging="360"/>
+        <w:ind w:left="2880" w:hanging="480"/>
       </w:pPr>
     </w:lvl>
     <w:lvl w:ilvl="4">
@@ -1165,7 +1252,7 @@
       <w:lvlText w:val="%5."/>
       <w:lvlJc w:val="left"/>
       <w:pPr>
-        <w:ind w:left="3600" w:hanging="360"/>
+        <w:ind w:left="3600" w:hanging="480"/>
       </w:pPr>
     </w:lvl>
     <w:lvl w:ilvl="5">
@@ -1174,7 +1261,7 @@
       <w:lvlText w:val="%6."/>
       <w:lvlJc w:val="left"/>
       <w:pPr>
-        <w:ind w:left="4320" w:hanging="360"/>
+        <w:ind w:left="4320" w:hanging="480"/>
       </w:pPr>
     </w:lvl>
     <w:lvl w:ilvl="6">
@@ -1183,7 +1270,7 @@
       <w:lvlText w:val="%7."/>
       <w:lvlJc w:val="left"/>
       <w:pPr>
-        <w:ind w:left="5040" w:hanging="360"/>
+        <w:ind w:left="5040" w:hanging="480"/>
       </w:pPr>
     </w:lvl>
     <w:lvl w:ilvl="7">
@@ -1192,7 +1279,7 @@
       <w:lvlText w:val="%8."/>
       <w:lvlJc w:val="left"/>
       <w:pPr>
-        <w:ind w:left="5760" w:hanging="360"/>
+        <w:ind w:left="5760" w:hanging="480"/>
       </w:pPr>
     </w:lvl>
     <w:lvl w:ilvl="8">
@@ -1201,12 +1288,12 @@
       <w:lvlText w:val="%9."/>
       <w:lvlJc w:val="left"/>
       <w:pPr>
-        <w:ind w:left="6480" w:hanging="360"/>
+        <w:ind w:left="6480" w:hanging="480"/>
       </w:pPr>
     </w:lvl>
   </w:abstractNum>
   <w:abstractNum w:abstractNumId="99414">
-    <w:nsid w:val="00A99414"/>
+    <w:nsid w:val="A99414"/>
     <w:multiLevelType w:val="multilevel"/>
     <w:lvl w:ilvl="0">
       <w:start w:val="4"/>
@@ -1214,7 +1301,7 @@
       <w:lvlText w:val="%1."/>
       <w:lvlJc w:val="left"/>
       <w:pPr>
-        <w:ind w:left="720" w:hanging="360"/>
+        <w:ind w:left="720" w:hanging="480"/>
       </w:pPr>
     </w:lvl>
     <w:lvl w:ilvl="1">
@@ -1223,7 +1310,7 @@
       <w:lvlText w:val="%2."/>
       <w:lvlJc w:val="left"/>
       <w:pPr>
-        <w:ind w:left="1440" w:hanging="360"/>
+        <w:ind w:left="1440" w:hanging="480"/>
       </w:pPr>
     </w:lvl>
     <w:lvl w:ilvl="2">
@@ -1232,7 +1319,7 @@
       <w:lvlText w:val="%3."/>
       <w:lvlJc w:val="left"/>
       <w:pPr>
-        <w:ind w:left="2160" w:hanging="360"/>
+        <w:ind w:left="2160" w:hanging="480"/>
       </w:pPr>
     </w:lvl>
     <w:lvl w:ilvl="3">
@@ -1241,7 +1328,7 @@
       <w:lvlText w:val="%4."/>
       <w:lvlJc w:val="left"/>
       <w:pPr>
-        <w:ind w:left="2880" w:hanging="360"/>
+        <w:ind w:left="2880" w:hanging="480"/>
       </w:pPr>
     </w:lvl>
     <w:lvl w:ilvl="4">
@@ -1250,7 +1337,7 @@
       <w:lvlText w:val="%5."/>
       <w:lvlJc w:val="left"/>
       <w:pPr>
-        <w:ind w:left="3600" w:hanging="360"/>
+        <w:ind w:left="3600" w:hanging="480"/>
       </w:pPr>
     </w:lvl>
     <w:lvl w:ilvl="5">
@@ -1259,7 +1346,7 @@
       <w:lvlText w:val="%6."/>
       <w:lvlJc w:val="left"/>
       <w:pPr>
-        <w:ind w:left="4320" w:hanging="360"/>
+        <w:ind w:left="4320" w:hanging="480"/>
       </w:pPr>
     </w:lvl>
     <w:lvl w:ilvl="6">
@@ -1268,7 +1355,7 @@
       <w:lvlText w:val="%7."/>
       <w:lvlJc w:val="left"/>
       <w:pPr>
-        <w:ind w:left="5040" w:hanging="360"/>
+        <w:ind w:left="5040" w:hanging="480"/>
       </w:pPr>
     </w:lvl>
     <w:lvl w:ilvl="7">
@@ -1277,7 +1364,7 @@
       <w:lvlText w:val="%8."/>
       <w:lvlJc w:val="left"/>
       <w:pPr>
-        <w:ind w:left="5760" w:hanging="360"/>
+        <w:ind w:left="5760" w:hanging="480"/>
       </w:pPr>
     </w:lvl>
     <w:lvl w:ilvl="8">
@@ -1286,12 +1373,12 @@
       <w:lvlText w:val="%9."/>
       <w:lvlJc w:val="left"/>
       <w:pPr>
-        <w:ind w:left="6480" w:hanging="360"/>
+        <w:ind w:left="6480" w:hanging="480"/>
       </w:pPr>
     </w:lvl>
   </w:abstractNum>
   <w:abstractNum w:abstractNumId="99415">
-    <w:nsid w:val="00A99415"/>
+    <w:nsid w:val="A99415"/>
     <w:multiLevelType w:val="multilevel"/>
     <w:lvl w:ilvl="0">
       <w:start w:val="5"/>
@@ -1299,7 +1386,7 @@
       <w:lvlText w:val="%1."/>
       <w:lvlJc w:val="left"/>
       <w:pPr>
-        <w:ind w:left="720" w:hanging="360"/>
+        <w:ind w:left="720" w:hanging="480"/>
       </w:pPr>
     </w:lvl>
     <w:lvl w:ilvl="1">
@@ -1308,7 +1395,7 @@
       <w:lvlText w:val="%2."/>
       <w:lvlJc w:val="left"/>
       <w:pPr>
-        <w:ind w:left="1440" w:hanging="360"/>
+        <w:ind w:left="1440" w:hanging="480"/>
       </w:pPr>
     </w:lvl>
     <w:lvl w:ilvl="2">
@@ -1317,7 +1404,7 @@
       <w:lvlText w:val="%3."/>
       <w:lvlJc w:val="left"/>
       <w:pPr>
-        <w:ind w:left="2160" w:hanging="360"/>
+        <w:ind w:left="2160" w:hanging="480"/>
       </w:pPr>
     </w:lvl>
     <w:lvl w:ilvl="3">
@@ -1326,7 +1413,7 @@
       <w:lvlText w:val="%4."/>
       <w:lvlJc w:val="left"/>
       <w:pPr>
-        <w:ind w:left="2880" w:hanging="360"/>
+        <w:ind w:left="2880" w:hanging="480"/>
       </w:pPr>
     </w:lvl>
     <w:lvl w:ilvl="4">
@@ -1335,7 +1422,7 @@
       <w:lvlText w:val="%5."/>
       <w:lvlJc w:val="left"/>
       <w:pPr>
-        <w:ind w:left="3600" w:hanging="360"/>
+        <w:ind w:left="3600" w:hanging="480"/>
       </w:pPr>
     </w:lvl>
     <w:lvl w:ilvl="5">
@@ -1344,7 +1431,7 @@
       <w:lvlText w:val="%6."/>
       <w:lvlJc w:val="left"/>
       <w:pPr>
-        <w:ind w:left="4320" w:hanging="360"/>
+        <w:ind w:left="4320" w:hanging="480"/>
       </w:pPr>
     </w:lvl>
     <w:lvl w:ilvl="6">
@@ -1353,7 +1440,7 @@
       <w:lvlText w:val="%7."/>
       <w:lvlJc w:val="left"/>
       <w:pPr>
-        <w:ind w:left="5040" w:hanging="360"/>
+        <w:ind w:left="5040" w:hanging="480"/>
       </w:pPr>
     </w:lvl>
     <w:lvl w:ilvl="7">
@@ -1362,7 +1449,7 @@
       <w:lvlText w:val="%8."/>
       <w:lvlJc w:val="left"/>
       <w:pPr>
-        <w:ind w:left="5760" w:hanging="360"/>
+        <w:ind w:left="5760" w:hanging="480"/>
       </w:pPr>
     </w:lvl>
     <w:lvl w:ilvl="8">
@@ -1371,12 +1458,12 @@
       <w:lvlText w:val="%9."/>
       <w:lvlJc w:val="left"/>
       <w:pPr>
-        <w:ind w:left="6480" w:hanging="360"/>
+        <w:ind w:left="6480" w:hanging="480"/>
       </w:pPr>
     </w:lvl>
   </w:abstractNum>
   <w:abstractNum w:abstractNumId="994112">
-    <w:nsid w:val="0A994112"/>
+    <w:nsid w:val="A994112"/>
     <w:multiLevelType w:val="multilevel"/>
     <w:lvl w:ilvl="0">
       <w:start w:val="12"/>
@@ -1384,7 +1471,7 @@
       <w:lvlText w:val="%1."/>
       <w:lvlJc w:val="left"/>
       <w:pPr>
-        <w:ind w:left="720" w:hanging="360"/>
+        <w:ind w:left="720" w:hanging="480"/>
       </w:pPr>
     </w:lvl>
     <w:lvl w:ilvl="1">
@@ -1393,7 +1480,7 @@
       <w:lvlText w:val="%2."/>
       <w:lvlJc w:val="left"/>
       <w:pPr>
-        <w:ind w:left="1440" w:hanging="360"/>
+        <w:ind w:left="1440" w:hanging="480"/>
       </w:pPr>
     </w:lvl>
     <w:lvl w:ilvl="2">
@@ -1402,7 +1489,7 @@
       <w:lvlText w:val="%3."/>
       <w:lvlJc w:val="left"/>
       <w:pPr>
-        <w:ind w:left="2160" w:hanging="360"/>
+        <w:ind w:left="2160" w:hanging="480"/>
       </w:pPr>
     </w:lvl>
     <w:lvl w:ilvl="3">
@@ -1411,7 +1498,7 @@
       <w:lvlText w:val="%4."/>
       <w:lvlJc w:val="left"/>
       <w:pPr>
-        <w:ind w:left="2880" w:hanging="360"/>
+        <w:ind w:left="2880" w:hanging="480"/>
       </w:pPr>
     </w:lvl>
     <w:lvl w:ilvl="4">
@@ -1420,7 +1507,7 @@
       <w:lvlText w:val="%5."/>
       <w:lvlJc w:val="left"/>
       <w:pPr>
-        <w:ind w:left="3600" w:hanging="360"/>
+        <w:ind w:left="3600" w:hanging="480"/>
       </w:pPr>
     </w:lvl>
     <w:lvl w:ilvl="5">
@@ -1429,7 +1516,7 @@
       <w:lvlText w:val="%6."/>
       <w:lvlJc w:val="left"/>
       <w:pPr>
-        <w:ind w:left="4320" w:hanging="360"/>
+        <w:ind w:left="4320" w:hanging="480"/>
       </w:pPr>
     </w:lvl>
     <w:lvl w:ilvl="6">
@@ -1438,7 +1525,7 @@
       <w:lvlText w:val="%7."/>
       <w:lvlJc w:val="left"/>
       <w:pPr>
-        <w:ind w:left="5040" w:hanging="360"/>
+        <w:ind w:left="5040" w:hanging="480"/>
       </w:pPr>
     </w:lvl>
     <w:lvl w:ilvl="7">
@@ -1447,7 +1534,7 @@
       <w:lvlText w:val="%8."/>
       <w:lvlJc w:val="left"/>
       <w:pPr>
-        <w:ind w:left="5760" w:hanging="360"/>
+        <w:ind w:left="5760" w:hanging="480"/>
       </w:pPr>
     </w:lvl>
     <w:lvl w:ilvl="8">
@@ -1456,12 +1543,12 @@
       <w:lvlText w:val="%9."/>
       <w:lvlJc w:val="left"/>
       <w:pPr>
-        <w:ind w:left="6480" w:hanging="360"/>
+        <w:ind w:left="6480" w:hanging="480"/>
       </w:pPr>
     </w:lvl>
   </w:abstractNum>
   <w:abstractNum w:abstractNumId="994115">
-    <w:nsid w:val="0A994115"/>
+    <w:nsid w:val="A994115"/>
     <w:multiLevelType w:val="multilevel"/>
     <w:lvl w:ilvl="0">
       <w:start w:val="15"/>
@@ -1469,7 +1556,7 @@
       <w:lvlText w:val="%1."/>
       <w:lvlJc w:val="left"/>
       <w:pPr>
-        <w:ind w:left="720" w:hanging="360"/>
+        <w:ind w:left="720" w:hanging="480"/>
       </w:pPr>
     </w:lvl>
     <w:lvl w:ilvl="1">
@@ -1478,7 +1565,7 @@
       <w:lvlText w:val="%2."/>
       <w:lvlJc w:val="left"/>
       <w:pPr>
-        <w:ind w:left="1440" w:hanging="360"/>
+        <w:ind w:left="1440" w:hanging="480"/>
       </w:pPr>
     </w:lvl>
     <w:lvl w:ilvl="2">
@@ -1487,7 +1574,7 @@
       <w:lvlText w:val="%3."/>
       <w:lvlJc w:val="left"/>
       <w:pPr>
-        <w:ind w:left="2160" w:hanging="360"/>
+        <w:ind w:left="2160" w:hanging="480"/>
       </w:pPr>
     </w:lvl>
     <w:lvl w:ilvl="3">
@@ -1496,7 +1583,7 @@
       <w:lvlText w:val="%4."/>
       <w:lvlJc w:val="left"/>
       <w:pPr>
-        <w:ind w:left="2880" w:hanging="360"/>
+        <w:ind w:left="2880" w:hanging="480"/>
       </w:pPr>
     </w:lvl>
     <w:lvl w:ilvl="4">
@@ -1505,7 +1592,7 @@
       <w:lvlText w:val="%5."/>
       <w:lvlJc w:val="left"/>
       <w:pPr>
-        <w:ind w:left="3600" w:hanging="360"/>
+        <w:ind w:left="3600" w:hanging="480"/>
       </w:pPr>
     </w:lvl>
     <w:lvl w:ilvl="5">
@@ -1514,7 +1601,7 @@
       <w:lvlText w:val="%6."/>
       <w:lvlJc w:val="left"/>
       <w:pPr>
-        <w:ind w:left="4320" w:hanging="360"/>
+        <w:ind w:left="4320" w:hanging="480"/>
       </w:pPr>
     </w:lvl>
     <w:lvl w:ilvl="6">
@@ -1523,7 +1610,7 @@
       <w:lvlText w:val="%7."/>
       <w:lvlJc w:val="left"/>
       <w:pPr>
-        <w:ind w:left="5040" w:hanging="360"/>
+        <w:ind w:left="5040" w:hanging="480"/>
       </w:pPr>
     </w:lvl>
     <w:lvl w:ilvl="7">
@@ -1532,7 +1619,7 @@
       <w:lvlText w:val="%8."/>
       <w:lvlJc w:val="left"/>
       <w:pPr>
-        <w:ind w:left="5760" w:hanging="360"/>
+        <w:ind w:left="5760" w:hanging="480"/>
       </w:pPr>
     </w:lvl>
     <w:lvl w:ilvl="8">
@@ -1541,12 +1628,12 @@
       <w:lvlText w:val="%9."/>
       <w:lvlJc w:val="left"/>
       <w:pPr>
-        <w:ind w:left="6480" w:hanging="360"/>
+        <w:ind w:left="6480" w:hanging="480"/>
       </w:pPr>
     </w:lvl>
   </w:abstractNum>
   <w:abstractNum w:abstractNumId="994116">
-    <w:nsid w:val="0A994116"/>
+    <w:nsid w:val="A994116"/>
     <w:multiLevelType w:val="multilevel"/>
     <w:lvl w:ilvl="0">
       <w:start w:val="16"/>
@@ -1554,7 +1641,7 @@
       <w:lvlText w:val="%1."/>
       <w:lvlJc w:val="left"/>
       <w:pPr>
-        <w:ind w:left="720" w:hanging="360"/>
+        <w:ind w:left="720" w:hanging="480"/>
       </w:pPr>
     </w:lvl>
     <w:lvl w:ilvl="1">
@@ -1563,7 +1650,7 @@
       <w:lvlText w:val="%2."/>
       <w:lvlJc w:val="left"/>
       <w:pPr>
-        <w:ind w:left="1440" w:hanging="360"/>
+        <w:ind w:left="1440" w:hanging="480"/>
       </w:pPr>
     </w:lvl>
     <w:lvl w:ilvl="2">
@@ -1572,7 +1659,7 @@
       <w:lvlText w:val="%3."/>
       <w:lvlJc w:val="left"/>
       <w:pPr>
-        <w:ind w:left="2160" w:hanging="360"/>
+        <w:ind w:left="2160" w:hanging="480"/>
       </w:pPr>
     </w:lvl>
     <w:lvl w:ilvl="3">
@@ -1581,7 +1668,7 @@
       <w:lvlText w:val="%4."/>
       <w:lvlJc w:val="left"/>
       <w:pPr>
-        <w:ind w:left="2880" w:hanging="360"/>
+        <w:ind w:left="2880" w:hanging="480"/>
       </w:pPr>
     </w:lvl>
     <w:lvl w:ilvl="4">
@@ -1590,7 +1677,7 @@
       <w:lvlText w:val="%5."/>
       <w:lvlJc w:val="left"/>
       <w:pPr>
-        <w:ind w:left="3600" w:hanging="360"/>
+        <w:ind w:left="3600" w:hanging="480"/>
       </w:pPr>
     </w:lvl>
     <w:lvl w:ilvl="5">
@@ -1599,7 +1686,7 @@
       <w:lvlText w:val="%6."/>
       <w:lvlJc w:val="left"/>
       <w:pPr>
-        <w:ind w:left="4320" w:hanging="360"/>
+        <w:ind w:left="4320" w:hanging="480"/>
       </w:pPr>
     </w:lvl>
     <w:lvl w:ilvl="6">
@@ -1608,7 +1695,7 @@
       <w:lvlText w:val="%7."/>
       <w:lvlJc w:val="left"/>
       <w:pPr>
-        <w:ind w:left="5040" w:hanging="360"/>
+        <w:ind w:left="5040" w:hanging="480"/>
       </w:pPr>
     </w:lvl>
     <w:lvl w:ilvl="7">
@@ -1617,7 +1704,7 @@
       <w:lvlText w:val="%8."/>
       <w:lvlJc w:val="left"/>
       <w:pPr>
-        <w:ind w:left="5760" w:hanging="360"/>
+        <w:ind w:left="5760" w:hanging="480"/>
       </w:pPr>
     </w:lvl>
     <w:lvl w:ilvl="8">
@@ -1626,12 +1713,12 @@
       <w:lvlText w:val="%9."/>
       <w:lvlJc w:val="left"/>
       <w:pPr>
-        <w:ind w:left="6480" w:hanging="360"/>
+        <w:ind w:left="6480" w:hanging="480"/>
       </w:pPr>
     </w:lvl>
   </w:abstractNum>
   <w:abstractNum w:abstractNumId="994117">
-    <w:nsid w:val="0A994117"/>
+    <w:nsid w:val="A994117"/>
     <w:multiLevelType w:val="multilevel"/>
     <w:lvl w:ilvl="0">
       <w:start w:val="17"/>
@@ -1639,7 +1726,7 @@
       <w:lvlText w:val="%1."/>
       <w:lvlJc w:val="left"/>
       <w:pPr>
-        <w:ind w:left="720" w:hanging="360"/>
+        <w:ind w:left="720" w:hanging="480"/>
       </w:pPr>
     </w:lvl>
     <w:lvl w:ilvl="1">
@@ -1648,7 +1735,7 @@
       <w:lvlText w:val="%2."/>
       <w:lvlJc w:val="left"/>
       <w:pPr>
-        <w:ind w:left="1440" w:hanging="360"/>
+        <w:ind w:left="1440" w:hanging="480"/>
       </w:pPr>
     </w:lvl>
     <w:lvl w:ilvl="2">
@@ -1657,7 +1744,7 @@
       <w:lvlText w:val="%3."/>
       <w:lvlJc w:val="left"/>
       <w:pPr>
-        <w:ind w:left="2160" w:hanging="360"/>
+        <w:ind w:left="2160" w:hanging="480"/>
       </w:pPr>
     </w:lvl>
     <w:lvl w:ilvl="3">
@@ -1666,7 +1753,7 @@
       <w:lvlText w:val="%4."/>
       <w:lvlJc w:val="left"/>
       <w:pPr>
-        <w:ind w:left="2880" w:hanging="360"/>
+        <w:ind w:left="2880" w:hanging="480"/>
       </w:pPr>
     </w:lvl>
     <w:lvl w:ilvl="4">
@@ -1675,7 +1762,7 @@
       <w:lvlText w:val="%5."/>
       <w:lvlJc w:val="left"/>
       <w:pPr>
-        <w:ind w:left="3600" w:hanging="360"/>
+        <w:ind w:left="3600" w:hanging="480"/>
       </w:pPr>
     </w:lvl>
     <w:lvl w:ilvl="5">
@@ -1684,7 +1771,7 @@
       <w:lvlText w:val="%6."/>
       <w:lvlJc w:val="left"/>
       <w:pPr>
-        <w:ind w:left="4320" w:hanging="360"/>
+        <w:ind w:left="4320" w:hanging="480"/>
       </w:pPr>
     </w:lvl>
     <w:lvl w:ilvl="6">
@@ -1693,7 +1780,7 @@
       <w:lvlText w:val="%7."/>
       <w:lvlJc w:val="left"/>
       <w:pPr>
-        <w:ind w:left="5040" w:hanging="360"/>
+        <w:ind w:left="5040" w:hanging="480"/>
       </w:pPr>
     </w:lvl>
     <w:lvl w:ilvl="7">
@@ -1702,7 +1789,7 @@
       <w:lvlText w:val="%8."/>
       <w:lvlJc w:val="left"/>
       <w:pPr>
-        <w:ind w:left="5760" w:hanging="360"/>
+        <w:ind w:left="5760" w:hanging="480"/>
       </w:pPr>
     </w:lvl>
     <w:lvl w:ilvl="8">
@@ -1711,12 +1798,12 @@
       <w:lvlText w:val="%9."/>
       <w:lvlJc w:val="left"/>
       <w:pPr>
-        <w:ind w:left="6480" w:hanging="360"/>
+        <w:ind w:left="6480" w:hanging="480"/>
       </w:pPr>
     </w:lvl>
   </w:abstractNum>
   <w:abstractNum w:abstractNumId="994122">
-    <w:nsid w:val="0A994122"/>
+    <w:nsid w:val="A994122"/>
     <w:multiLevelType w:val="multilevel"/>
     <w:lvl w:ilvl="0">
       <w:start w:val="22"/>
@@ -1724,7 +1811,7 @@
       <w:lvlText w:val="%1."/>
       <w:lvlJc w:val="left"/>
       <w:pPr>
-        <w:ind w:left="720" w:hanging="360"/>
+        <w:ind w:left="720" w:hanging="480"/>
       </w:pPr>
     </w:lvl>
     <w:lvl w:ilvl="1">
@@ -1733,7 +1820,7 @@
       <w:lvlText w:val="%2."/>
       <w:lvlJc w:val="left"/>
       <w:pPr>
-        <w:ind w:left="1440" w:hanging="360"/>
+        <w:ind w:left="1440" w:hanging="480"/>
       </w:pPr>
     </w:lvl>
     <w:lvl w:ilvl="2">
@@ -1742,7 +1829,7 @@
       <w:lvlText w:val="%3."/>
       <w:lvlJc w:val="left"/>
       <w:pPr>
-        <w:ind w:left="2160" w:hanging="360"/>
+        <w:ind w:left="2160" w:hanging="480"/>
       </w:pPr>
     </w:lvl>
     <w:lvl w:ilvl="3">
@@ -1751,7 +1838,7 @@
       <w:lvlText w:val="%4."/>
       <w:lvlJc w:val="left"/>
       <w:pPr>
-        <w:ind w:left="2880" w:hanging="360"/>
+        <w:ind w:left="2880" w:hanging="480"/>
       </w:pPr>
     </w:lvl>
     <w:lvl w:ilvl="4">
@@ -1760,7 +1847,7 @@
       <w:lvlText w:val="%5."/>
       <w:lvlJc w:val="left"/>
       <w:pPr>
-        <w:ind w:left="3600" w:hanging="360"/>
+        <w:ind w:left="3600" w:hanging="480"/>
       </w:pPr>
     </w:lvl>
     <w:lvl w:ilvl="5">
@@ -1769,7 +1856,7 @@
       <w:lvlText w:val="%6."/>
       <w:lvlJc w:val="left"/>
       <w:pPr>
-        <w:ind w:left="4320" w:hanging="360"/>
+        <w:ind w:left="4320" w:hanging="480"/>
       </w:pPr>
     </w:lvl>
     <w:lvl w:ilvl="6">
@@ -1778,7 +1865,7 @@
       <w:lvlText w:val="%7."/>
       <w:lvlJc w:val="left"/>
       <w:pPr>
-        <w:ind w:left="5040" w:hanging="360"/>
+        <w:ind w:left="5040" w:hanging="480"/>
       </w:pPr>
     </w:lvl>
     <w:lvl w:ilvl="7">
@@ -1787,7 +1874,7 @@
       <w:lvlText w:val="%8."/>
       <w:lvlJc w:val="left"/>
       <w:pPr>
-        <w:ind w:left="5760" w:hanging="360"/>
+        <w:ind w:left="5760" w:hanging="480"/>
       </w:pPr>
     </w:lvl>
     <w:lvl w:ilvl="8">
@@ -1796,7 +1883,7 @@
       <w:lvlText w:val="%9."/>
       <w:lvlJc w:val="left"/>
       <w:pPr>
-        <w:ind w:left="6480" w:hanging="360"/>
+        <w:ind w:left="6480" w:hanging="480"/>
       </w:pPr>
     </w:lvl>
   </w:abstractNum>
@@ -2792,266 +2879,266 @@
       <w:color w:themeColor="accent1" w:themeShade="BF" w:val="365F91"/>
     </w:rPr>
   </w:style>
-  <w:style w:type="paragraph" w:customStyle="1" w:styleId="SourceCode">
+  <w:style w:customStyle="1" w:styleId="SourceCode" w:type="paragraph">
     <w:name w:val="Source Code"/>
     <w:basedOn w:val="Normal"/>
     <w:link w:val="VerbatimChar"/>
     <w:pPr>
       <w:wordWrap w:val="off"/>
-      <w:shd w:val="clear" w:fill="f1f3f5"/>
+      <w:shd w:fill="f1f3f5" w:val="clear"/>
     </w:pPr>
   </w:style>
-  <w:style w:type="character" w:customStyle="1" w:styleId="KeywordTok">
+  <w:style w:customStyle="1" w:styleId="KeywordTok" w:type="character">
     <w:name w:val="KeywordTok"/>
     <w:basedOn w:val="VerbatimChar"/>
     <w:rPr>
       <w:b/>
       <w:color w:val="003b4f"/>
-      <w:shd w:val="clear" w:fill="f1f3f5"/>
-    </w:rPr>
-  </w:style>
-  <w:style w:type="character" w:customStyle="1" w:styleId="DataTypeTok">
+      <w:shd w:fill="f1f3f5" w:val="clear"/>
+    </w:rPr>
+  </w:style>
+  <w:style w:customStyle="1" w:styleId="DataTypeTok" w:type="character">
     <w:name w:val="DataTypeTok"/>
     <w:basedOn w:val="VerbatimChar"/>
     <w:rPr>
       <w:color w:val="ad0000"/>
-      <w:shd w:val="clear" w:fill="f1f3f5"/>
-    </w:rPr>
-  </w:style>
-  <w:style w:type="character" w:customStyle="1" w:styleId="DecValTok">
+      <w:shd w:fill="f1f3f5" w:val="clear"/>
+    </w:rPr>
+  </w:style>
+  <w:style w:customStyle="1" w:styleId="DecValTok" w:type="character">
     <w:name w:val="DecValTok"/>
     <w:basedOn w:val="VerbatimChar"/>
     <w:rPr>
       <w:color w:val="ad0000"/>
-      <w:shd w:val="clear" w:fill="f1f3f5"/>
-    </w:rPr>
-  </w:style>
-  <w:style w:type="character" w:customStyle="1" w:styleId="BaseNTok">
+      <w:shd w:fill="f1f3f5" w:val="clear"/>
+    </w:rPr>
+  </w:style>
+  <w:style w:customStyle="1" w:styleId="BaseNTok" w:type="character">
     <w:name w:val="BaseNTok"/>
     <w:basedOn w:val="VerbatimChar"/>
     <w:rPr>
       <w:color w:val="ad0000"/>
-      <w:shd w:val="clear" w:fill="f1f3f5"/>
-    </w:rPr>
-  </w:style>
-  <w:style w:type="character" w:customStyle="1" w:styleId="FloatTok">
+      <w:shd w:fill="f1f3f5" w:val="clear"/>
+    </w:rPr>
+  </w:style>
+  <w:style w:customStyle="1" w:styleId="FloatTok" w:type="character">
     <w:name w:val="FloatTok"/>
     <w:basedOn w:val="VerbatimChar"/>
     <w:rPr>
       <w:color w:val="ad0000"/>
-      <w:shd w:val="clear" w:fill="f1f3f5"/>
-    </w:rPr>
-  </w:style>
-  <w:style w:type="character" w:customStyle="1" w:styleId="ConstantTok">
+      <w:shd w:fill="f1f3f5" w:val="clear"/>
+    </w:rPr>
+  </w:style>
+  <w:style w:customStyle="1" w:styleId="ConstantTok" w:type="character">
     <w:name w:val="ConstantTok"/>
     <w:basedOn w:val="VerbatimChar"/>
     <w:rPr>
       <w:color w:val="8f5902"/>
-      <w:shd w:val="clear" w:fill="f1f3f5"/>
-    </w:rPr>
-  </w:style>
-  <w:style w:type="character" w:customStyle="1" w:styleId="CharTok">
+      <w:shd w:fill="f1f3f5" w:val="clear"/>
+    </w:rPr>
+  </w:style>
+  <w:style w:customStyle="1" w:styleId="CharTok" w:type="character">
     <w:name w:val="CharTok"/>
     <w:basedOn w:val="VerbatimChar"/>
     <w:rPr>
       <w:color w:val="20794d"/>
-      <w:shd w:val="clear" w:fill="f1f3f5"/>
-    </w:rPr>
-  </w:style>
-  <w:style w:type="character" w:customStyle="1" w:styleId="SpecialCharTok">
+      <w:shd w:fill="f1f3f5" w:val="clear"/>
+    </w:rPr>
+  </w:style>
+  <w:style w:customStyle="1" w:styleId="SpecialCharTok" w:type="character">
     <w:name w:val="SpecialCharTok"/>
     <w:basedOn w:val="VerbatimChar"/>
     <w:rPr>
       <w:color w:val="5e5e5e"/>
-      <w:shd w:val="clear" w:fill="f1f3f5"/>
-    </w:rPr>
-  </w:style>
-  <w:style w:type="character" w:customStyle="1" w:styleId="StringTok">
+      <w:shd w:fill="f1f3f5" w:val="clear"/>
+    </w:rPr>
+  </w:style>
+  <w:style w:customStyle="1" w:styleId="StringTok" w:type="character">
     <w:name w:val="StringTok"/>
     <w:basedOn w:val="VerbatimChar"/>
     <w:rPr>
       <w:color w:val="20794d"/>
-      <w:shd w:val="clear" w:fill="f1f3f5"/>
-    </w:rPr>
-  </w:style>
-  <w:style w:type="character" w:customStyle="1" w:styleId="VerbatimStringTok">
+      <w:shd w:fill="f1f3f5" w:val="clear"/>
+    </w:rPr>
+  </w:style>
+  <w:style w:customStyle="1" w:styleId="VerbatimStringTok" w:type="character">
     <w:name w:val="VerbatimStringTok"/>
     <w:basedOn w:val="VerbatimChar"/>
     <w:rPr>
       <w:color w:val="20794d"/>
-      <w:shd w:val="clear" w:fill="f1f3f5"/>
-    </w:rPr>
-  </w:style>
-  <w:style w:type="character" w:customStyle="1" w:styleId="SpecialStringTok">
+      <w:shd w:fill="f1f3f5" w:val="clear"/>
+    </w:rPr>
+  </w:style>
+  <w:style w:customStyle="1" w:styleId="SpecialStringTok" w:type="character">
     <w:name w:val="SpecialStringTok"/>
     <w:basedOn w:val="VerbatimChar"/>
     <w:rPr>
       <w:color w:val="20794d"/>
-      <w:shd w:val="clear" w:fill="f1f3f5"/>
-    </w:rPr>
-  </w:style>
-  <w:style w:type="character" w:customStyle="1" w:styleId="ImportTok">
+      <w:shd w:fill="f1f3f5" w:val="clear"/>
+    </w:rPr>
+  </w:style>
+  <w:style w:customStyle="1" w:styleId="ImportTok" w:type="character">
     <w:name w:val="ImportTok"/>
     <w:basedOn w:val="VerbatimChar"/>
     <w:rPr>
       <w:color w:val="00769e"/>
-      <w:shd w:val="clear" w:fill="f1f3f5"/>
-    </w:rPr>
-  </w:style>
-  <w:style w:type="character" w:customStyle="1" w:styleId="CommentTok">
+      <w:shd w:fill="f1f3f5" w:val="clear"/>
+    </w:rPr>
+  </w:style>
+  <w:style w:customStyle="1" w:styleId="CommentTok" w:type="character">
     <w:name w:val="CommentTok"/>
     <w:basedOn w:val="VerbatimChar"/>
     <w:rPr>
       <w:color w:val="5e5e5e"/>
-      <w:shd w:val="clear" w:fill="f1f3f5"/>
-    </w:rPr>
-  </w:style>
-  <w:style w:type="character" w:customStyle="1" w:styleId="DocumentationTok">
+      <w:shd w:fill="f1f3f5" w:val="clear"/>
+    </w:rPr>
+  </w:style>
+  <w:style w:customStyle="1" w:styleId="DocumentationTok" w:type="character">
     <w:name w:val="DocumentationTok"/>
     <w:basedOn w:val="VerbatimChar"/>
     <w:rPr>
       <w:i/>
       <w:color w:val="5e5e5e"/>
-      <w:shd w:val="clear" w:fill="f1f3f5"/>
-    </w:rPr>
-  </w:style>
-  <w:style w:type="character" w:customStyle="1" w:styleId="AnnotationTok">
+      <w:shd w:fill="f1f3f5" w:val="clear"/>
+    </w:rPr>
+  </w:style>
+  <w:style w:customStyle="1" w:styleId="AnnotationTok" w:type="character">
     <w:name w:val="AnnotationTok"/>
     <w:basedOn w:val="VerbatimChar"/>
     <w:rPr>
       <w:color w:val="5e5e5e"/>
-      <w:shd w:val="clear" w:fill="f1f3f5"/>
-    </w:rPr>
-  </w:style>
-  <w:style w:type="character" w:customStyle="1" w:styleId="CommentVarTok">
+      <w:shd w:fill="f1f3f5" w:val="clear"/>
+    </w:rPr>
+  </w:style>
+  <w:style w:customStyle="1" w:styleId="CommentVarTok" w:type="character">
     <w:name w:val="CommentVarTok"/>
     <w:basedOn w:val="VerbatimChar"/>
     <w:rPr>
       <w:i/>
       <w:color w:val="5e5e5e"/>
-      <w:shd w:val="clear" w:fill="f1f3f5"/>
-    </w:rPr>
-  </w:style>
-  <w:style w:type="character" w:customStyle="1" w:styleId="OtherTok">
+      <w:shd w:fill="f1f3f5" w:val="clear"/>
+    </w:rPr>
+  </w:style>
+  <w:style w:customStyle="1" w:styleId="OtherTok" w:type="character">
     <w:name w:val="OtherTok"/>
     <w:basedOn w:val="VerbatimChar"/>
     <w:rPr>
       <w:color w:val="003b4f"/>
-      <w:shd w:val="clear" w:fill="f1f3f5"/>
-    </w:rPr>
-  </w:style>
-  <w:style w:type="character" w:customStyle="1" w:styleId="FunctionTok">
+      <w:shd w:fill="f1f3f5" w:val="clear"/>
+    </w:rPr>
+  </w:style>
+  <w:style w:customStyle="1" w:styleId="FunctionTok" w:type="character">
     <w:name w:val="FunctionTok"/>
     <w:basedOn w:val="VerbatimChar"/>
     <w:rPr>
       <w:color w:val="4758ab"/>
-      <w:shd w:val="clear" w:fill="f1f3f5"/>
-    </w:rPr>
-  </w:style>
-  <w:style w:type="character" w:customStyle="1" w:styleId="VariableTok">
+      <w:shd w:fill="f1f3f5" w:val="clear"/>
+    </w:rPr>
+  </w:style>
+  <w:style w:customStyle="1" w:styleId="VariableTok" w:type="character">
     <w:name w:val="VariableTok"/>
     <w:basedOn w:val="VerbatimChar"/>
     <w:rPr>
       <w:color w:val="111111"/>
-      <w:shd w:val="clear" w:fill="f1f3f5"/>
-    </w:rPr>
-  </w:style>
-  <w:style w:type="character" w:customStyle="1" w:styleId="ControlFlowTok">
+      <w:shd w:fill="f1f3f5" w:val="clear"/>
+    </w:rPr>
+  </w:style>
+  <w:style w:customStyle="1" w:styleId="ControlFlowTok" w:type="character">
     <w:name w:val="ControlFlowTok"/>
     <w:basedOn w:val="VerbatimChar"/>
     <w:rPr>
       <w:b/>
       <w:color w:val="003b4f"/>
-      <w:shd w:val="clear" w:fill="f1f3f5"/>
-    </w:rPr>
-  </w:style>
-  <w:style w:type="character" w:customStyle="1" w:styleId="OperatorTok">
+      <w:shd w:fill="f1f3f5" w:val="clear"/>
+    </w:rPr>
+  </w:style>
+  <w:style w:customStyle="1" w:styleId="OperatorTok" w:type="character">
     <w:name w:val="OperatorTok"/>
     <w:basedOn w:val="VerbatimChar"/>
     <w:rPr>
       <w:color w:val="5e5e5e"/>
-      <w:shd w:val="clear" w:fill="f1f3f5"/>
-    </w:rPr>
-  </w:style>
-  <w:style w:type="character" w:customStyle="1" w:styleId="BuiltInTok">
+      <w:shd w:fill="f1f3f5" w:val="clear"/>
+    </w:rPr>
+  </w:style>
+  <w:style w:customStyle="1" w:styleId="BuiltInTok" w:type="character">
     <w:name w:val="BuiltInTok"/>
     <w:basedOn w:val="VerbatimChar"/>
     <w:rPr>
       <w:color w:val="003b4f"/>
-      <w:shd w:val="clear" w:fill="f1f3f5"/>
-    </w:rPr>
-  </w:style>
-  <w:style w:type="character" w:customStyle="1" w:styleId="ExtensionTok">
+      <w:shd w:fill="f1f3f5" w:val="clear"/>
+    </w:rPr>
+  </w:style>
+  <w:style w:customStyle="1" w:styleId="ExtensionTok" w:type="character">
     <w:name w:val="ExtensionTok"/>
     <w:basedOn w:val="VerbatimChar"/>
     <w:rPr>
       <w:color w:val="003b4f"/>
-      <w:shd w:val="clear" w:fill="f1f3f5"/>
-    </w:rPr>
-  </w:style>
-  <w:style w:type="character" w:customStyle="1" w:styleId="PreprocessorTok">
+      <w:shd w:fill="f1f3f5" w:val="clear"/>
+    </w:rPr>
+  </w:style>
+  <w:style w:customStyle="1" w:styleId="PreprocessorTok" w:type="character">
     <w:name w:val="PreprocessorTok"/>
     <w:basedOn w:val="VerbatimChar"/>
     <w:rPr>
       <w:color w:val="ad0000"/>
-      <w:shd w:val="clear" w:fill="f1f3f5"/>
-    </w:rPr>
-  </w:style>
-  <w:style w:type="character" w:customStyle="1" w:styleId="AttributeTok">
+      <w:shd w:fill="f1f3f5" w:val="clear"/>
+    </w:rPr>
+  </w:style>
+  <w:style w:customStyle="1" w:styleId="AttributeTok" w:type="character">
     <w:name w:val="AttributeTok"/>
     <w:basedOn w:val="VerbatimChar"/>
     <w:rPr>
       <w:color w:val="657422"/>
-      <w:shd w:val="clear" w:fill="f1f3f5"/>
-    </w:rPr>
-  </w:style>
-  <w:style w:type="character" w:customStyle="1" w:styleId="RegionMarkerTok">
+      <w:shd w:fill="f1f3f5" w:val="clear"/>
+    </w:rPr>
+  </w:style>
+  <w:style w:customStyle="1" w:styleId="RegionMarkerTok" w:type="character">
     <w:name w:val="RegionMarkerTok"/>
     <w:basedOn w:val="VerbatimChar"/>
     <w:rPr>
       <w:color w:val="003b4f"/>
-      <w:shd w:val="clear" w:fill="f1f3f5"/>
-    </w:rPr>
-  </w:style>
-  <w:style w:type="character" w:customStyle="1" w:styleId="InformationTok">
+      <w:shd w:fill="f1f3f5" w:val="clear"/>
+    </w:rPr>
+  </w:style>
+  <w:style w:customStyle="1" w:styleId="InformationTok" w:type="character">
     <w:name w:val="InformationTok"/>
     <w:basedOn w:val="VerbatimChar"/>
     <w:rPr>
       <w:color w:val="5e5e5e"/>
-      <w:shd w:val="clear" w:fill="f1f3f5"/>
-    </w:rPr>
-  </w:style>
-  <w:style w:type="character" w:customStyle="1" w:styleId="WarningTok">
+      <w:shd w:fill="f1f3f5" w:val="clear"/>
+    </w:rPr>
+  </w:style>
+  <w:style w:customStyle="1" w:styleId="WarningTok" w:type="character">
     <w:name w:val="WarningTok"/>
     <w:basedOn w:val="VerbatimChar"/>
     <w:rPr>
       <w:i/>
       <w:color w:val="5e5e5e"/>
-      <w:shd w:val="clear" w:fill="f1f3f5"/>
-    </w:rPr>
-  </w:style>
-  <w:style w:type="character" w:customStyle="1" w:styleId="AlertTok">
+      <w:shd w:fill="f1f3f5" w:val="clear"/>
+    </w:rPr>
+  </w:style>
+  <w:style w:customStyle="1" w:styleId="AlertTok" w:type="character">
     <w:name w:val="AlertTok"/>
     <w:basedOn w:val="VerbatimChar"/>
     <w:rPr>
       <w:color w:val="ad0000"/>
-      <w:shd w:val="clear" w:fill="f1f3f5"/>
-    </w:rPr>
-  </w:style>
-  <w:style w:type="character" w:customStyle="1" w:styleId="ErrorTok">
+      <w:shd w:fill="f1f3f5" w:val="clear"/>
+    </w:rPr>
+  </w:style>
+  <w:style w:customStyle="1" w:styleId="ErrorTok" w:type="character">
     <w:name w:val="ErrorTok"/>
     <w:basedOn w:val="VerbatimChar"/>
     <w:rPr>
       <w:color w:val="ad0000"/>
-      <w:shd w:val="clear" w:fill="f1f3f5"/>
-    </w:rPr>
-  </w:style>
-  <w:style w:type="character" w:customStyle="1" w:styleId="NormalTok">
+      <w:shd w:fill="f1f3f5" w:val="clear"/>
+    </w:rPr>
+  </w:style>
+  <w:style w:customStyle="1" w:styleId="NormalTok" w:type="character">
     <w:name w:val="NormalTok"/>
     <w:basedOn w:val="VerbatimChar"/>
     <w:rPr>
       <w:color w:val="003b4f"/>
-      <w:shd w:val="clear" w:fill="f1f3f5"/>
+      <w:shd w:fill="f1f3f5" w:val="clear"/>
     </w:rPr>
   </w:style>
 </w:styles>

</xml_diff>